<commit_message>
updated MVPM Hackathon Progress Tracker
</commit_message>
<xml_diff>
--- a/MVPM_Hackathon_Progress_Tracker.docx
+++ b/MVPM_Hackathon_Progress_Tracker.docx
@@ -14,22 +14,63 @@
     <w:p>
       <w:r>
         <w:br/>
-        <w:t>Team Name: ____________________________</w:t>
+        <w:t>Team Name: _</w:t>
+      </w:r>
+      <w:r>
+        <w:rPr>
+          <w:u w:val="single"/>
+        </w:rPr>
+        <w:t>Mediflow</w:t>
+      </w:r>
+      <w:r>
+        <w:t>_</w:t>
       </w:r>
     </w:p>
     <w:p>
       <w:r>
-        <w:t>Team Members: _________________________</w:t>
+        <w:t>Team Members: _</w:t>
+      </w:r>
+      <w:r>
+        <w:rPr>
+          <w:u w:val="single"/>
+        </w:rPr>
+        <w:t>Jayraj Rathi, Sarvesh Rathi, Pranav Navandar, Shubham Son</w:t>
+      </w:r>
+      <w:r>
+        <w:rPr>
+          <w:u w:val="single"/>
+        </w:rPr>
+        <w:t>i</w:t>
+      </w:r>
+      <w:r>
+        <w:t>_</w:t>
       </w:r>
     </w:p>
     <w:p>
       <w:r>
-        <w:t>__________________________________________</w:t>
+        <w:t>Date: _</w:t>
       </w:r>
-    </w:p>
-    <w:p>
       <w:r>
-        <w:t>Date: _________________________________</w:t>
+        <w:rPr>
+          <w:u w:val="single"/>
+        </w:rPr>
+        <w:t>11</w:t>
+      </w:r>
+      <w:r>
+        <w:rPr>
+          <w:u w:val="single"/>
+          <w:vertAlign w:val="superscript"/>
+        </w:rPr>
+        <w:t>th</w:t>
+      </w:r>
+      <w:r>
+        <w:rPr>
+          <w:u w:val="single"/>
+        </w:rPr>
+        <w:t xml:space="preserve"> April 2026</w:t>
+      </w:r>
+      <w:r>
+        <w:t>_</w:t>
       </w:r>
       <w:r>
         <w:br/>
@@ -45,90 +86,310 @@
       </w:r>
     </w:p>
     <w:p>
+      <w:pPr>
+        <w:rPr>
+          <w:b/>
+          <w:bCs/>
+        </w:rPr>
+      </w:pPr>
       <w:r>
+        <w:rPr>
+          <w:b/>
+          <w:bCs/>
+        </w:rPr>
         <w:br/>
         <w:t>Problem Statement:</w:t>
       </w:r>
     </w:p>
     <w:p>
       <w:r>
-        <w:t>__________________________________________</w:t>
+        <w:t>Mediflow aims to reduce the heavy documentation burden on doctors in Indian outpatient clinics by automatically transcrib</w:t>
+      </w:r>
+      <w:r>
+        <w:t xml:space="preserve">ing </w:t>
+      </w:r>
+      <w:r>
+        <w:t>consultations and extract structured Electronic Medical Records (EMRs)</w:t>
+      </w:r>
+      <w:r>
+        <w:t xml:space="preserve"> </w:t>
+      </w:r>
+      <w:r>
+        <w:t>allowing them to focus entirely on patient care.</w:t>
       </w:r>
     </w:p>
     <w:p>
+      <w:pPr>
+        <w:rPr>
+          <w:b/>
+          <w:bCs/>
+        </w:rPr>
+      </w:pPr>
       <w:r>
-        <w:t>__________________________________________</w:t>
-      </w:r>
-    </w:p>
-    <w:p>
-      <w:r>
+        <w:rPr>
+          <w:b/>
+          <w:bCs/>
+        </w:rPr>
         <w:br/>
         <w:t>Current Features / Modules Completed:</w:t>
       </w:r>
     </w:p>
     <w:p>
+      <w:pPr>
+        <w:rPr>
+          <w:lang w:val="en-IN"/>
+        </w:rPr>
+      </w:pPr>
       <w:r>
-        <w:t>☐ ________________________________________</w:t>
+        <w:rPr>
+          <w:rFonts w:ascii="Segoe UI Symbol" w:hAnsi="Segoe UI Symbol" w:cs="Segoe UI Symbol"/>
+          <w:lang w:val="en-IN"/>
+        </w:rPr>
+        <w:t>☑</w:t>
+      </w:r>
+      <w:r>
+        <w:rPr>
+          <w:lang w:val="en-IN"/>
+        </w:rPr>
+        <w:t xml:space="preserve"> Real-time Speech-to-Text (STT) transcription (Sarvam AI / Deepgram)</w:t>
       </w:r>
     </w:p>
     <w:p>
+      <w:pPr>
+        <w:rPr>
+          <w:lang w:val="en-IN"/>
+        </w:rPr>
+      </w:pPr>
       <w:r>
-        <w:t>☐ ________________________________________</w:t>
+        <w:rPr>
+          <w:rFonts w:ascii="Segoe UI Symbol" w:hAnsi="Segoe UI Symbol" w:cs="Segoe UI Symbol"/>
+          <w:lang w:val="en-IN"/>
+        </w:rPr>
+        <w:t>☑</w:t>
+      </w:r>
+      <w:r>
+        <w:rPr>
+          <w:lang w:val="en-IN"/>
+        </w:rPr>
+        <w:t xml:space="preserve"> AI-Powered EMR extraction engine (Groq LLM</w:t>
+      </w:r>
+      <w:r>
+        <w:rPr>
+          <w:lang w:val="en-IN"/>
+        </w:rPr>
+        <w:t xml:space="preserve"> / Google Medgemma </w:t>
+      </w:r>
+      <w:r>
+        <w:rPr>
+          <w:lang w:val="en-IN"/>
+        </w:rPr>
+        <w:t xml:space="preserve">1.5 4B </w:t>
+      </w:r>
+      <w:r>
+        <w:rPr>
+          <w:lang w:val="en-IN"/>
+        </w:rPr>
+        <w:t>after testing integration</w:t>
+      </w:r>
+      <w:r>
+        <w:rPr>
+          <w:lang w:val="en-IN"/>
+        </w:rPr>
+        <w:t>)</w:t>
       </w:r>
     </w:p>
     <w:p>
+      <w:pPr>
+        <w:rPr>
+          <w:lang w:val="en-IN"/>
+        </w:rPr>
+      </w:pPr>
       <w:r>
-        <w:t>☐ ________________________________________</w:t>
+        <w:rPr>
+          <w:rFonts w:ascii="Segoe UI Symbol" w:hAnsi="Segoe UI Symbol" w:cs="Segoe UI Symbol"/>
+          <w:lang w:val="en-IN"/>
+        </w:rPr>
+        <w:t>☑</w:t>
+      </w:r>
+      <w:r>
+        <w:rPr>
+          <w:lang w:val="en-IN"/>
+        </w:rPr>
+        <w:t xml:space="preserve"> ICD-10 clinical coding system with automatic mapping</w:t>
       </w:r>
     </w:p>
     <w:p>
+      <w:pPr>
+        <w:rPr>
+          <w:lang w:val="en-IN"/>
+        </w:rPr>
+      </w:pPr>
       <w:r>
-        <w:t>☐ ________________________________________</w:t>
+        <w:rPr>
+          <w:rFonts w:ascii="Segoe UI Symbol" w:hAnsi="Segoe UI Symbol" w:cs="Segoe UI Symbol"/>
+          <w:lang w:val="en-IN"/>
+        </w:rPr>
+        <w:t>☑</w:t>
+      </w:r>
+      <w:r>
+        <w:rPr>
+          <w:lang w:val="en-IN"/>
+        </w:rPr>
+        <w:t xml:space="preserve"> Multi-role authentication &amp; consultation management (Doctor/Receptionist)</w:t>
       </w:r>
     </w:p>
     <w:p>
+      <w:pPr>
+        <w:rPr>
+          <w:lang w:val="en-IN"/>
+        </w:rPr>
+      </w:pPr>
       <w:r>
+        <w:rPr>
+          <w:rFonts w:ascii="Segoe UI Symbol" w:hAnsi="Segoe UI Symbol" w:cs="Segoe UI Symbol"/>
+          <w:lang w:val="en-IN"/>
+        </w:rPr>
+        <w:t>☑</w:t>
+      </w:r>
+      <w:r>
+        <w:rPr>
+          <w:rFonts w:ascii="Segoe UI Symbol" w:hAnsi="Segoe UI Symbol" w:cs="Segoe UI Symbol"/>
+          <w:lang w:val="en-IN"/>
+        </w:rPr>
+        <w:t xml:space="preserve"> </w:t>
+      </w:r>
+      <w:r>
+        <w:rPr>
+          <w:lang w:val="en-IN"/>
+        </w:rPr>
+        <w:t>Patient history view (allergies, surgeries, family history, past visits)</w:t>
+      </w:r>
+    </w:p>
+    <w:p>
+      <w:pPr>
+        <w:rPr>
+          <w:b/>
+          <w:bCs/>
+        </w:rPr>
+      </w:pPr>
+      <w:r>
+        <w:rPr>
+          <w:b/>
+          <w:bCs/>
+        </w:rPr>
         <w:br/>
         <w:t>Tech Stack Used:</w:t>
       </w:r>
     </w:p>
     <w:p>
       <w:r>
-        <w:t>__________________________________________</w:t>
+        <w:rPr>
+          <w:i/>
+          <w:iCs/>
+        </w:rPr>
+        <w:t>Frontend:</w:t>
+      </w:r>
+      <w:r>
+        <w:t xml:space="preserve"> Next.js, React, Tailwind CSS. </w:t>
       </w:r>
     </w:p>
     <w:p>
       <w:r>
-        <w:t>__________________________________________</w:t>
+        <w:rPr>
+          <w:i/>
+          <w:iCs/>
+        </w:rPr>
+        <w:t>Backend/Database:</w:t>
+      </w:r>
+      <w:r>
+        <w:t xml:space="preserve"> Supabase (PostgreSQL), MongoDB Atlas. </w:t>
       </w:r>
     </w:p>
     <w:p>
       <w:r>
-        <w:br/>
+        <w:rPr>
+          <w:i/>
+          <w:iCs/>
+        </w:rPr>
+        <w:t>AI/STT:</w:t>
+      </w:r>
+      <w:r>
+        <w:t xml:space="preserve"> Groq SDK, </w:t>
+      </w:r>
+      <w:r>
+        <w:t xml:space="preserve">Google MedGemma, </w:t>
+      </w:r>
+      <w:r>
+        <w:t>Sarvam AI SDK, Deepgram SDK.</w:t>
+      </w:r>
+    </w:p>
+    <w:p/>
+    <w:p>
+      <w:pPr>
+        <w:rPr>
+          <w:b/>
+          <w:bCs/>
+        </w:rPr>
+      </w:pPr>
+      <w:r>
+        <w:rPr>
+          <w:b/>
+          <w:bCs/>
+        </w:rPr>
         <w:t>Current Working Status:</w:t>
       </w:r>
     </w:p>
     <w:p>
       <w:r>
-        <w:t>☐ Idea Stage</w:t>
+        <w:rPr>
+          <w:rFonts w:ascii="Segoe UI Symbol" w:hAnsi="Segoe UI Symbol" w:cs="Segoe UI Symbol"/>
+          <w:lang w:val="en-IN"/>
+        </w:rPr>
+        <w:t>☑</w:t>
+      </w:r>
+      <w:r>
+        <w:rPr>
+          <w:rFonts w:ascii="Segoe UI Symbol" w:hAnsi="Segoe UI Symbol" w:cs="Segoe UI Symbol"/>
+          <w:lang w:val="en-IN"/>
+        </w:rPr>
+        <w:t xml:space="preserve"> </w:t>
+      </w:r>
+      <w:r>
+        <w:t xml:space="preserve"> Idea Stage</w:t>
       </w:r>
     </w:p>
     <w:p>
       <w:r>
-        <w:t>☐ Partial Implementation</w:t>
+        <w:rPr>
+          <w:rFonts w:ascii="Segoe UI Symbol" w:hAnsi="Segoe UI Symbol" w:cs="Segoe UI Symbol"/>
+          <w:lang w:val="en-IN"/>
+        </w:rPr>
+        <w:lastRenderedPageBreak/>
+        <w:t>☑</w:t>
+      </w:r>
+      <w:r>
+        <w:rPr>
+          <w:rFonts w:ascii="Segoe UI Symbol" w:hAnsi="Segoe UI Symbol" w:cs="Segoe UI Symbol"/>
+          <w:lang w:val="en-IN"/>
+        </w:rPr>
+        <w:t xml:space="preserve"> </w:t>
+      </w:r>
+      <w:r>
+        <w:t>Partial Implementation</w:t>
       </w:r>
     </w:p>
     <w:p>
       <w:r>
-        <w:t>☐ Working Prototype</w:t>
+        <w:t xml:space="preserve">☐ </w:t>
+      </w:r>
+      <w:r>
+        <w:t xml:space="preserve"> Complete End-to-End </w:t>
+      </w:r>
+      <w:r>
+        <w:t>Working Prototype</w:t>
       </w:r>
     </w:p>
-    <w:p>
-      <w:r>
-        <w:lastRenderedPageBreak/>
-        <w:br/>
-      </w:r>
-    </w:p>
+    <w:p/>
     <w:p>
       <w:r>
         <w:rPr>
@@ -139,116 +400,266 @@
       </w:r>
     </w:p>
     <w:p>
+      <w:pPr>
+        <w:rPr>
+          <w:b/>
+          <w:bCs/>
+        </w:rPr>
+      </w:pPr>
       <w:r>
+        <w:rPr>
+          <w:b/>
+          <w:bCs/>
+        </w:rPr>
         <w:br/>
         <w:t>Key Goals:</w:t>
       </w:r>
     </w:p>
     <w:p>
+      <w:pPr>
+        <w:rPr>
+          <w:lang w:val="en-IN"/>
+        </w:rPr>
+      </w:pPr>
       <w:r>
-        <w:t>☐ ________________________________________</w:t>
+        <w:rPr>
+          <w:rFonts w:ascii="Segoe UI Symbol" w:hAnsi="Segoe UI Symbol" w:cs="Segoe UI Symbol"/>
+          <w:lang w:val="en-IN"/>
+        </w:rPr>
+        <w:t>☑</w:t>
+      </w:r>
+      <w:r>
+        <w:rPr>
+          <w:lang w:val="en-IN"/>
+        </w:rPr>
+        <w:t xml:space="preserve"> Differentiate doctor and patient voices accurately during live transcription</w:t>
+      </w:r>
+      <w:r>
+        <w:rPr>
+          <w:lang w:val="en-IN"/>
+        </w:rPr>
+        <w:t xml:space="preserve"> (Speaker Diarization)</w:t>
+      </w:r>
+      <w:r>
+        <w:rPr>
+          <w:lang w:val="en-IN"/>
+        </w:rPr>
+        <w:t>.</w:t>
       </w:r>
     </w:p>
     <w:p>
+      <w:pPr>
+        <w:rPr>
+          <w:lang w:val="en-IN"/>
+        </w:rPr>
+      </w:pPr>
       <w:r>
-        <w:t>☐ ________________________________________</w:t>
+        <w:rPr>
+          <w:rFonts w:ascii="Segoe UI Symbol" w:hAnsi="Segoe UI Symbol" w:cs="Segoe UI Symbol"/>
+          <w:lang w:val="en-IN"/>
+        </w:rPr>
+        <w:t>☑</w:t>
+      </w:r>
+      <w:r>
+        <w:rPr>
+          <w:lang w:val="en-IN"/>
+        </w:rPr>
+        <w:t xml:space="preserve"> Implement AI safety checks for drug interactions and missing critical information</w:t>
+      </w:r>
+      <w:r>
+        <w:rPr>
+          <w:lang w:val="en-IN"/>
+        </w:rPr>
+        <w:t xml:space="preserve"> to improve clinical outcomes.</w:t>
       </w:r>
     </w:p>
     <w:p>
+      <w:pPr>
+        <w:rPr>
+          <w:lang w:val="en-IN"/>
+        </w:rPr>
+      </w:pPr>
       <w:r>
-        <w:t>☐ ________________________________________</w:t>
+        <w:rPr>
+          <w:rFonts w:ascii="Segoe UI Symbol" w:hAnsi="Segoe UI Symbol" w:cs="Segoe UI Symbol"/>
+          <w:lang w:val="en-IN"/>
+        </w:rPr>
+        <w:t>☑</w:t>
+      </w:r>
+      <w:r>
+        <w:rPr>
+          <w:lang w:val="en-IN"/>
+        </w:rPr>
+        <w:t xml:space="preserve"> Automate the delivery of simplified medical reports directly to patients</w:t>
+      </w:r>
+      <w:r>
+        <w:rPr>
+          <w:lang w:val="en-IN"/>
+        </w:rPr>
+        <w:t xml:space="preserve"> as soon as the consultation has ended.</w:t>
       </w:r>
     </w:p>
     <w:p>
+      <w:pPr>
+        <w:rPr>
+          <w:b/>
+          <w:bCs/>
+        </w:rPr>
+      </w:pPr>
       <w:r>
+        <w:rPr>
+          <w:b/>
+          <w:bCs/>
+        </w:rPr>
         <w:br/>
         <w:t>Features to be Added:</w:t>
       </w:r>
     </w:p>
     <w:p>
+      <w:pPr>
+        <w:rPr>
+          <w:lang w:val="en-IN"/>
+        </w:rPr>
+      </w:pPr>
       <w:r>
-        <w:t>☐ ________________________________________</w:t>
+        <w:rPr>
+          <w:rFonts w:ascii="Segoe UI Symbol" w:hAnsi="Segoe UI Symbol" w:cs="Segoe UI Symbol"/>
+          <w:lang w:val="en-IN"/>
+        </w:rPr>
+        <w:t>☑</w:t>
+      </w:r>
+      <w:r>
+        <w:rPr>
+          <w:lang w:val="en-IN"/>
+        </w:rPr>
+        <w:t xml:space="preserve"> </w:t>
+      </w:r>
+      <w:r>
+        <w:rPr>
+          <w:b/>
+          <w:bCs/>
+          <w:lang w:val="en-IN"/>
+        </w:rPr>
+        <w:t>Speaker Diarization:</w:t>
+      </w:r>
+      <w:r>
+        <w:rPr>
+          <w:lang w:val="en-IN"/>
+        </w:rPr>
+        <w:t xml:space="preserve"> Sarvam AI SDK integration.</w:t>
       </w:r>
     </w:p>
     <w:p>
+      <w:pPr>
+        <w:rPr>
+          <w:lang w:val="en-IN"/>
+        </w:rPr>
+      </w:pPr>
       <w:r>
-        <w:t>☐ ________________________________________</w:t>
+        <w:rPr>
+          <w:rFonts w:ascii="Segoe UI Symbol" w:hAnsi="Segoe UI Symbol" w:cs="Segoe UI Symbol"/>
+          <w:lang w:val="en-IN"/>
+        </w:rPr>
+        <w:t>☑</w:t>
+      </w:r>
+      <w:r>
+        <w:rPr>
+          <w:lang w:val="en-IN"/>
+        </w:rPr>
+        <w:t xml:space="preserve"> </w:t>
+      </w:r>
+      <w:r>
+        <w:rPr>
+          <w:b/>
+          <w:bCs/>
+          <w:lang w:val="en-IN"/>
+        </w:rPr>
+        <w:t>Clinical Safety Guards:</w:t>
+      </w:r>
+      <w:r>
+        <w:rPr>
+          <w:lang w:val="en-IN"/>
+        </w:rPr>
+        <w:t xml:space="preserve"> Groq LLM</w:t>
+      </w:r>
+      <w:r>
+        <w:rPr>
+          <w:lang w:val="en-IN"/>
+        </w:rPr>
+        <w:t xml:space="preserve"> / MedGemma</w:t>
+      </w:r>
+      <w:r>
+        <w:rPr>
+          <w:lang w:val="en-IN"/>
+        </w:rPr>
+        <w:t xml:space="preserve"> prompt engineering.</w:t>
       </w:r>
     </w:p>
     <w:p>
+      <w:pPr>
+        <w:rPr>
+          <w:lang w:val="en-IN"/>
+        </w:rPr>
+      </w:pPr>
       <w:r>
-        <w:t>☐ ________________________________________</w:t>
+        <w:rPr>
+          <w:rFonts w:ascii="Segoe UI Symbol" w:hAnsi="Segoe UI Symbol" w:cs="Segoe UI Symbol"/>
+          <w:lang w:val="en-IN"/>
+        </w:rPr>
+        <w:t>☑</w:t>
+      </w:r>
+      <w:r>
+        <w:rPr>
+          <w:lang w:val="en-IN"/>
+        </w:rPr>
+        <w:t xml:space="preserve"> </w:t>
+      </w:r>
+      <w:r>
+        <w:rPr>
+          <w:b/>
+          <w:bCs/>
+          <w:lang w:val="en-IN"/>
+        </w:rPr>
+        <w:t>Reports Storage for Patients’ Access:</w:t>
+      </w:r>
+      <w:r>
+        <w:rPr>
+          <w:lang w:val="en-IN"/>
+        </w:rPr>
+        <w:t xml:space="preserve"> </w:t>
+      </w:r>
+      <w:r>
+        <w:rPr>
+          <w:lang w:val="en-IN"/>
+        </w:rPr>
+        <w:t>Stores in Mongodb database.</w:t>
       </w:r>
     </w:p>
-    <w:tbl>
-      <w:tblPr>
-        <w:tblW w:w="0" w:type="auto"/>
-        <w:tblLook w:val="04A0" w:firstRow="1" w:lastRow="0" w:firstColumn="1" w:lastColumn="0" w:noHBand="0" w:noVBand="1"/>
-      </w:tblPr>
-      <w:tblGrid>
-        <w:gridCol w:w="4320"/>
-        <w:gridCol w:w="4320"/>
-      </w:tblGrid>
-      <w:tr>
-        <w:tc>
-          <w:tcPr>
-            <w:tcW w:w="4320" w:type="dxa"/>
-          </w:tcPr>
-          <w:p/>
-        </w:tc>
-        <w:tc>
-          <w:tcPr>
-            <w:tcW w:w="4320" w:type="dxa"/>
-          </w:tcPr>
-          <w:p/>
-        </w:tc>
-      </w:tr>
-      <w:tr>
-        <w:tc>
-          <w:tcPr>
-            <w:tcW w:w="4320" w:type="dxa"/>
-          </w:tcPr>
-          <w:p/>
-        </w:tc>
-        <w:tc>
-          <w:tcPr>
-            <w:tcW w:w="4320" w:type="dxa"/>
-          </w:tcPr>
-          <w:p/>
-        </w:tc>
-      </w:tr>
-      <w:tr>
-        <w:tc>
-          <w:tcPr>
-            <w:tcW w:w="4320" w:type="dxa"/>
-          </w:tcPr>
-          <w:p/>
-        </w:tc>
-        <w:tc>
-          <w:tcPr>
-            <w:tcW w:w="4320" w:type="dxa"/>
-          </w:tcPr>
-          <w:p/>
-        </w:tc>
-      </w:tr>
-    </w:tbl>
     <w:p>
+      <w:pPr>
+        <w:rPr>
+          <w:b/>
+          <w:bCs/>
+        </w:rPr>
+      </w:pPr>
       <w:r>
+        <w:rPr>
+          <w:b/>
+          <w:bCs/>
+        </w:rPr>
         <w:br/>
         <w:t>Expected Outcome by End of Hackathon:</w:t>
       </w:r>
     </w:p>
     <w:p>
+      <w:pPr>
+        <w:rPr>
+          <w:b/>
+          <w:sz w:val="28"/>
+        </w:rPr>
+      </w:pPr>
       <w:r>
-        <w:t>__________________________________________</w:t>
-      </w:r>
-    </w:p>
-    <w:p>
-      <w:r>
-        <w:t>__________________________________________</w:t>
-      </w:r>
-      <w:r>
-        <w:br/>
+        <w:t>A fully functional, polished MVP that not only transcribes and extracts EMRs but safely verifies drug interactions, accurately separates speakers, and instantly delivers both original and simplified reports to the patient.</w:t>
       </w:r>
     </w:p>
     <w:p>
@@ -287,6 +698,7 @@
         <w:t>☐ ________________________________________</w:t>
       </w:r>
     </w:p>
+    <w:p/>
     <w:p>
       <w:r>
         <w:br/>
@@ -1140,7 +1552,6 @@
   <w:style w:type="character" w:default="1" w:styleId="DefaultParagraphFont">
     <w:name w:val="Default Paragraph Font"/>
     <w:uiPriority w:val="1"/>
-    <w:semiHidden/>
     <w:unhideWhenUsed/>
   </w:style>
   <w:style w:type="table" w:default="1" w:styleId="TableNormal">

</xml_diff>